<commit_message>
Updated training manuals to include new Law Tag system.
Also removed redundant pdf versions of training manuals
</commit_message>
<xml_diff>
--- a/TrainingManual1_Veteran.docx
+++ b/TrainingManual1_Veteran.docx
@@ -325,12 +325,29 @@
           <w:ilvl w:val="1"/>
           <w:numId w:val="8"/>
         </w:numPr>
-      </w:pPr>
-      <w:r>
         <w:rPr>
           <w:rStyle w:val="SubtleReference"/>
+          <w:smallCaps w:val="0"/>
+          <w:color w:val="auto"/>
+        </w:rPr>
+      </w:pPr>
+      <w:r>
+        <w:rPr>
+          <w:rStyle w:val="SubtleReference"/>
         </w:rPr>
         <w:t>Police Force</w:t>
+      </w:r>
+    </w:p>
+    <w:p>
+      <w:pPr>
+        <w:pStyle w:val="ListParagraph"/>
+        <w:numPr>
+          <w:ilvl w:val="0"/>
+          <w:numId w:val="8"/>
+        </w:numPr>
+      </w:pPr>
+      <w:r>
+        <w:t>Take one pair of Law Tags, put one on your Law, and one on the Collect action space.</w:t>
       </w:r>
     </w:p>
     <w:p>
@@ -373,6 +390,7 @@
         </w:rPr>
       </w:pPr>
       <w:r>
+        <w:lastRenderedPageBreak/>
         <w:t>“</w:t>
       </w:r>
       <w:r>
@@ -391,7 +409,6 @@
         </w:numPr>
       </w:pPr>
       <w:r>
-        <w:lastRenderedPageBreak/>
         <w:t>Take the King’s Favor.</w:t>
       </w:r>
     </w:p>
@@ -834,6 +851,7 @@
         <w:pStyle w:val="Heading2"/>
       </w:pPr>
       <w:r>
+        <w:lastRenderedPageBreak/>
         <w:t>Report Phase</w:t>
       </w:r>
     </w:p>
@@ -857,7 +875,6 @@
         <w:pStyle w:val="Quote"/>
       </w:pPr>
       <w:r>
-        <w:lastRenderedPageBreak/>
         <w:t>“Everyone</w:t>
       </w:r>
       <w:r>
@@ -1219,6 +1236,7 @@
         </w:numPr>
       </w:pPr>
       <w:r>
+        <w:lastRenderedPageBreak/>
         <w:t xml:space="preserve">After finishing this action, trade your </w:t>
       </w:r>
       <w:r>
@@ -1248,7 +1266,6 @@
         <w:pStyle w:val="Quote"/>
       </w:pPr>
       <w:r>
-        <w:lastRenderedPageBreak/>
         <w:t>“</w:t>
       </w:r>
       <w:r>
@@ -1377,23 +1394,7 @@
           <w:b w:val="0"/>
           <w:bCs w:val="0"/>
         </w:rPr>
-        <w:t>I have extra Coins, so I will Donate them</w:t>
-      </w:r>
-      <w:r>
-        <w:rPr>
-          <w:rStyle w:val="Strong"/>
-          <w:b w:val="0"/>
-          <w:bCs w:val="0"/>
-        </w:rPr>
-        <w:t xml:space="preserve"> to the King</w:t>
-      </w:r>
-      <w:r>
-        <w:rPr>
-          <w:rStyle w:val="Strong"/>
-          <w:b w:val="0"/>
-          <w:bCs w:val="0"/>
-        </w:rPr>
-        <w:t xml:space="preserve">. I may Donate 1 Coin per Leader Level. I’ll put those </w:t>
+        <w:t xml:space="preserve">I have extra Coins, so I will Donate them to the King. I may Donate 1 Coin per Leader Level. I’ll put those </w:t>
       </w:r>
       <w:r>
         <w:rPr>
@@ -3188,6 +3189,7 @@
   <w:style w:type="character" w:default="1" w:styleId="DefaultParagraphFont">
     <w:name w:val="Default Paragraph Font"/>
     <w:uiPriority w:val="1"/>
+    <w:semiHidden/>
     <w:unhideWhenUsed/>
   </w:style>
   <w:style w:type="table" w:default="1" w:styleId="TableNormal">

</xml_diff>